<commit_message>
Se hace Cambio de calendarizacion
</commit_message>
<xml_diff>
--- a/Front-SIPROE/public/assets/Anexo-Invitacion.docx
+++ b/Front-SIPROE/public/assets/Anexo-Invitacion.docx
@@ -1,6 +1,6 @@
 
 <file path=word/document.xml><?xml version="1.0" encoding="utf-8"?>
-<w:document xmlns:wpc="http://schemas.microsoft.com/office/word/2010/wordprocessingCanvas" xmlns:cx="http://schemas.microsoft.com/office/drawing/2014/chartex" xmlns:mc="http://schemas.openxmlformats.org/markup-compatibility/2006" xmlns:o="urn:schemas-microsoft-com:office:office" xmlns:r="http://schemas.openxmlformats.org/officeDocument/2006/relationships" xmlns:m="http://schemas.openxmlformats.org/officeDocument/2006/math" xmlns:v="urn:schemas-microsoft-com:vml" xmlns:wp14="http://schemas.microsoft.com/office/word/2010/wordprocessingDrawing" xmlns:wp="http://schemas.openxmlformats.org/drawingml/2006/wordprocessingDrawing" xmlns:w10="urn:schemas-microsoft-com:office:word" xmlns:w="http://schemas.openxmlformats.org/wordprocessingml/2006/main" xmlns:w14="http://schemas.microsoft.com/office/word/2010/wordml" xmlns:w15="http://schemas.microsoft.com/office/word/2012/wordml" xmlns:w16se="http://schemas.microsoft.com/office/word/2015/wordml/symex" xmlns:wpg="http://schemas.microsoft.com/office/word/2010/wordprocessingGroup" xmlns:wpi="http://schemas.microsoft.com/office/word/2010/wordprocessingInk" xmlns:wne="http://schemas.microsoft.com/office/word/2006/wordml" xmlns:wps="http://schemas.microsoft.com/office/word/2010/wordprocessingShape" mc:Ignorable="w14 w15 w16se wp14">
+<w:document xmlns:wpc="http://schemas.microsoft.com/office/word/2010/wordprocessingCanvas" xmlns:cx="http://schemas.microsoft.com/office/drawing/2014/chartex" xmlns:cx1="http://schemas.microsoft.com/office/drawing/2015/9/8/chartex" xmlns:cx2="http://schemas.microsoft.com/office/drawing/2015/10/21/chartex" xmlns:cx3="http://schemas.microsoft.com/office/drawing/2016/5/9/chartex" xmlns:cx4="http://schemas.microsoft.com/office/drawing/2016/5/10/chartex" xmlns:cx5="http://schemas.microsoft.com/office/drawing/2016/5/11/chartex" xmlns:cx6="http://schemas.microsoft.com/office/drawing/2016/5/12/chartex" xmlns:cx7="http://schemas.microsoft.com/office/drawing/2016/5/13/chartex" xmlns:cx8="http://schemas.microsoft.com/office/drawing/2016/5/14/chartex" xmlns:mc="http://schemas.openxmlformats.org/markup-compatibility/2006" xmlns:aink="http://schemas.microsoft.com/office/drawing/2016/ink" xmlns:am3d="http://schemas.microsoft.com/office/drawing/2017/model3d" xmlns:o="urn:schemas-microsoft-com:office:office" xmlns:oel="http://schemas.microsoft.com/office/2019/extlst" xmlns:r="http://schemas.openxmlformats.org/officeDocument/2006/relationships" xmlns:m="http://schemas.openxmlformats.org/officeDocument/2006/math" xmlns:v="urn:schemas-microsoft-com:vml" xmlns:wp14="http://schemas.microsoft.com/office/word/2010/wordprocessingDrawing" xmlns:wp="http://schemas.openxmlformats.org/drawingml/2006/wordprocessingDrawing" xmlns:w10="urn:schemas-microsoft-com:office:word" xmlns:w="http://schemas.openxmlformats.org/wordprocessingml/2006/main" xmlns:w14="http://schemas.microsoft.com/office/word/2010/wordml" xmlns:w15="http://schemas.microsoft.com/office/word/2012/wordml" xmlns:w16cex="http://schemas.microsoft.com/office/word/2018/wordml/cex" xmlns:w16cid="http://schemas.microsoft.com/office/word/2016/wordml/cid" xmlns:w16="http://schemas.microsoft.com/office/word/2018/wordml" xmlns:w16du="http://schemas.microsoft.com/office/word/2023/wordml/word16du" xmlns:w16sdtdh="http://schemas.microsoft.com/office/word/2020/wordml/sdtdatahash" xmlns:w16sdtfl="http://schemas.microsoft.com/office/word/2024/wordml/sdtformatlock" xmlns:w16se="http://schemas.microsoft.com/office/word/2015/wordml/symex" xmlns:wpg="http://schemas.microsoft.com/office/word/2010/wordprocessingGroup" xmlns:wpi="http://schemas.microsoft.com/office/word/2010/wordprocessingInk" xmlns:wne="http://schemas.microsoft.com/office/word/2006/wordml" xmlns:wps="http://schemas.microsoft.com/office/word/2010/wordprocessingShape" mc:Ignorable="w14 w15 w16se w16cid w16 w16cex w16sdtdh w16sdtfl w16du wp14">
   <w:body>
     <w:p>
       <w:pPr>
@@ -264,7 +264,7 @@
               </wp:anchor>
             </w:drawing>
           </mc:Choice>
-          <mc:Fallback xmlns:w16sdtfl="http://schemas.microsoft.com/office/word/2024/wordml/sdtformatlock" xmlns:w16sdtdh="http://schemas.microsoft.com/office/word/2020/wordml/sdtdatahash" xmlns:w16du="http://schemas.microsoft.com/office/word/2023/wordml/word16du" xmlns:w16="http://schemas.microsoft.com/office/word/2018/wordml" xmlns:w16cid="http://schemas.microsoft.com/office/word/2016/wordml/cid" xmlns:w16cex="http://schemas.microsoft.com/office/word/2018/wordml/cex" xmlns:oel="http://schemas.microsoft.com/office/2019/extlst" xmlns:am3d="http://schemas.microsoft.com/office/drawing/2017/model3d" xmlns:aink="http://schemas.microsoft.com/office/drawing/2016/ink" xmlns:cx8="http://schemas.microsoft.com/office/drawing/2016/5/14/chartex" xmlns:cx7="http://schemas.microsoft.com/office/drawing/2016/5/13/chartex" xmlns:cx6="http://schemas.microsoft.com/office/drawing/2016/5/12/chartex" xmlns:cx5="http://schemas.microsoft.com/office/drawing/2016/5/11/chartex" xmlns:cx4="http://schemas.microsoft.com/office/drawing/2016/5/10/chartex" xmlns:cx3="http://schemas.microsoft.com/office/drawing/2016/5/9/chartex" xmlns:cx2="http://schemas.microsoft.com/office/drawing/2015/10/21/chartex" xmlns:cx1="http://schemas.microsoft.com/office/drawing/2015/9/8/chartex">
+          <mc:Fallback>
             <w:pict>
               <v:shapetype w14:anchorId="725CCF86" id="_x0000_t202" coordsize="21600,21600" o:spt="202" path="m,l,21600r21600,l21600,xe">
                 <v:stroke joinstyle="miter"/>
@@ -373,8 +373,6 @@
         </w:rPr>
         <w:t>6 - 2027</w:t>
       </w:r>
-      <w:bookmarkStart w:id="0" w:name="_GoBack"/>
-      <w:bookmarkEnd w:id="0"/>
       <w:r>
         <w:rPr>
           <w:rFonts w:ascii="Arial" w:hAnsi="Arial" w:cs="Arial"/>
@@ -529,7 +527,8 @@
     <w:tbl>
       <w:tblPr>
         <w:tblStyle w:val="Tablaconcuadrcula"/>
-        <w:tblW w:w="9067" w:type="dxa"/>
+        <w:tblW w:w="10019" w:type="dxa"/>
+        <w:tblInd w:w="-596" w:type="dxa"/>
         <w:tblLook w:val="04A0" w:firstRow="1" w:lastRow="0" w:firstColumn="1" w:lastColumn="0" w:noHBand="0" w:noVBand="1"/>
       </w:tblPr>
       <w:tblGrid>
@@ -537,6 +536,7 @@
         <w:gridCol w:w="1896"/>
         <w:gridCol w:w="846"/>
         <w:gridCol w:w="2808"/>
+        <w:gridCol w:w="952"/>
         <w:gridCol w:w="952"/>
         <w:gridCol w:w="1257"/>
       </w:tblGrid>
@@ -547,7 +547,7 @@
         </w:trPr>
         <w:tc>
           <w:tcPr>
-            <w:tcW w:w="562" w:type="dxa"/>
+            <w:tcW w:w="1308" w:type="dxa"/>
             <w:shd w:val="clear" w:color="auto" w:fill="D9D9D9" w:themeFill="background1" w:themeFillShade="D9"/>
             <w:textDirection w:val="btLr"/>
             <w:vAlign w:val="center"/>
@@ -582,7 +582,7 @@
         </w:tc>
         <w:tc>
           <w:tcPr>
-            <w:tcW w:w="2127" w:type="dxa"/>
+            <w:tcW w:w="1896" w:type="dxa"/>
             <w:shd w:val="clear" w:color="auto" w:fill="D9D9D9" w:themeFill="background1" w:themeFillShade="D9"/>
             <w:vAlign w:val="center"/>
           </w:tcPr>
@@ -615,7 +615,7 @@
         </w:tc>
         <w:tc>
           <w:tcPr>
-            <w:tcW w:w="850" w:type="dxa"/>
+            <w:tcW w:w="846" w:type="dxa"/>
             <w:shd w:val="clear" w:color="auto" w:fill="D9D9D9" w:themeFill="background1" w:themeFillShade="D9"/>
             <w:vAlign w:val="center"/>
           </w:tcPr>
@@ -648,7 +648,7 @@
         </w:tc>
         <w:tc>
           <w:tcPr>
-            <w:tcW w:w="3544" w:type="dxa"/>
+            <w:tcW w:w="2808" w:type="dxa"/>
             <w:shd w:val="clear" w:color="auto" w:fill="D9D9D9" w:themeFill="background1" w:themeFillShade="D9"/>
             <w:vAlign w:val="center"/>
           </w:tcPr>
@@ -681,7 +681,7 @@
         </w:tc>
         <w:tc>
           <w:tcPr>
-            <w:tcW w:w="992" w:type="dxa"/>
+            <w:tcW w:w="952" w:type="dxa"/>
             <w:shd w:val="clear" w:color="auto" w:fill="D9D9D9" w:themeFill="background1" w:themeFillShade="D9"/>
             <w:vAlign w:val="center"/>
           </w:tcPr>
@@ -708,13 +708,46 @@
                 <w:szCs w:val="18"/>
                 <w:lang w:val="es-MX"/>
               </w:rPr>
-              <w:t>Fecha</w:t>
+              <w:t>Año</w:t>
             </w:r>
           </w:p>
         </w:tc>
         <w:tc>
           <w:tcPr>
-            <w:tcW w:w="992" w:type="dxa"/>
+            <w:tcW w:w="952" w:type="dxa"/>
+            <w:shd w:val="clear" w:color="auto" w:fill="D9D9D9" w:themeFill="background1" w:themeFillShade="D9"/>
+            <w:vAlign w:val="center"/>
+          </w:tcPr>
+          <w:p>
+            <w:pPr>
+              <w:jc w:val="center"/>
+              <w:rPr>
+                <w:rFonts w:ascii="Arial" w:eastAsiaTheme="minorHAnsi" w:hAnsi="Arial" w:cs="Arial"/>
+                <w:b/>
+                <w:bCs/>
+                <w:color w:val="000000"/>
+                <w:sz w:val="18"/>
+                <w:szCs w:val="18"/>
+                <w:lang w:val="es-MX"/>
+              </w:rPr>
+            </w:pPr>
+            <w:r>
+              <w:rPr>
+                <w:rFonts w:ascii="Arial" w:eastAsiaTheme="minorHAnsi" w:hAnsi="Arial" w:cs="Arial"/>
+                <w:b/>
+                <w:bCs/>
+                <w:color w:val="000000"/>
+                <w:sz w:val="18"/>
+                <w:szCs w:val="18"/>
+                <w:lang w:val="es-MX"/>
+              </w:rPr>
+              <w:t>Fecha</w:t>
+            </w:r>
+          </w:p>
+        </w:tc>
+        <w:tc>
+          <w:tcPr>
+            <w:tcW w:w="1257" w:type="dxa"/>
             <w:shd w:val="clear" w:color="auto" w:fill="D9D9D9" w:themeFill="background1" w:themeFillShade="D9"/>
             <w:vAlign w:val="center"/>
           </w:tcPr>
@@ -752,7 +785,7 @@
         </w:trPr>
         <w:tc>
           <w:tcPr>
-            <w:tcW w:w="562" w:type="dxa"/>
+            <w:tcW w:w="1308" w:type="dxa"/>
           </w:tcPr>
           <w:p>
             <w:pPr>
@@ -773,9 +806,17 @@
                 <w:szCs w:val="18"/>
                 <w:lang w:val="es-MX"/>
               </w:rPr>
-              <w:t xml:space="preserve">[[#productos]] </w:t>
-            </w:r>
-            <w:r>
+              <w:t>[[#productos]] [[id]]</w:t>
+            </w:r>
+          </w:p>
+        </w:tc>
+        <w:tc>
+          <w:tcPr>
+            <w:tcW w:w="1896" w:type="dxa"/>
+          </w:tcPr>
+          <w:p>
+            <w:pPr>
+              <w:jc w:val="center"/>
               <w:rPr>
                 <w:rFonts w:ascii="Arial" w:eastAsiaTheme="minorHAnsi" w:hAnsi="Arial" w:cs="Arial"/>
                 <w:color w:val="000000"/>
@@ -783,13 +824,71 @@
                 <w:szCs w:val="18"/>
                 <w:lang w:val="es-MX"/>
               </w:rPr>
-              <w:t>[[id]]</w:t>
+            </w:pPr>
+            <w:r>
+              <w:rPr>
+                <w:rFonts w:ascii="Arial" w:eastAsiaTheme="minorHAnsi" w:hAnsi="Arial" w:cs="Arial"/>
+                <w:color w:val="000000"/>
+                <w:sz w:val="18"/>
+                <w:szCs w:val="18"/>
+                <w:lang w:val="es-MX"/>
+              </w:rPr>
+              <w:t>[[</w:t>
+            </w:r>
+            <w:proofErr w:type="spellStart"/>
+            <w:r>
+              <w:rPr>
+                <w:rFonts w:ascii="Arial" w:eastAsiaTheme="minorHAnsi" w:hAnsi="Arial" w:cs="Arial"/>
+                <w:color w:val="000000"/>
+                <w:sz w:val="18"/>
+                <w:szCs w:val="18"/>
+                <w:lang w:val="es-MX"/>
+              </w:rPr>
+              <w:t>dt</w:t>
+            </w:r>
+            <w:proofErr w:type="spellEnd"/>
+            <w:r>
+              <w:rPr>
+                <w:rFonts w:ascii="Arial" w:eastAsiaTheme="minorHAnsi" w:hAnsi="Arial" w:cs="Arial"/>
+                <w:color w:val="000000"/>
+                <w:sz w:val="18"/>
+                <w:szCs w:val="18"/>
+                <w:lang w:val="es-MX"/>
+              </w:rPr>
+              <w:t>]]</w:t>
             </w:r>
           </w:p>
         </w:tc>
         <w:tc>
           <w:tcPr>
-            <w:tcW w:w="2127" w:type="dxa"/>
+            <w:tcW w:w="846" w:type="dxa"/>
+          </w:tcPr>
+          <w:p>
+            <w:pPr>
+              <w:jc w:val="both"/>
+              <w:rPr>
+                <w:rFonts w:ascii="Arial" w:eastAsiaTheme="minorHAnsi" w:hAnsi="Arial" w:cs="Arial"/>
+                <w:color w:val="000000"/>
+                <w:sz w:val="18"/>
+                <w:szCs w:val="18"/>
+                <w:lang w:val="es-MX"/>
+              </w:rPr>
+            </w:pPr>
+            <w:r>
+              <w:rPr>
+                <w:rFonts w:ascii="Arial" w:eastAsiaTheme="minorHAnsi" w:hAnsi="Arial" w:cs="Arial"/>
+                <w:color w:val="000000"/>
+                <w:sz w:val="18"/>
+                <w:szCs w:val="18"/>
+                <w:lang w:val="es-MX"/>
+              </w:rPr>
+              <w:t>[[clave]]</w:t>
+            </w:r>
+          </w:p>
+        </w:tc>
+        <w:tc>
+          <w:tcPr>
+            <w:tcW w:w="2808" w:type="dxa"/>
           </w:tcPr>
           <w:p>
             <w:pPr>
@@ -810,10 +909,17 @@
                 <w:szCs w:val="18"/>
                 <w:lang w:val="es-MX"/>
               </w:rPr>
-              <w:t>[[</w:t>
-            </w:r>
-            <w:proofErr w:type="spellStart"/>
-            <w:r>
+              <w:t>[[ut]]</w:t>
+            </w:r>
+          </w:p>
+        </w:tc>
+        <w:tc>
+          <w:tcPr>
+            <w:tcW w:w="952" w:type="dxa"/>
+          </w:tcPr>
+          <w:p>
+            <w:pPr>
+              <w:jc w:val="center"/>
               <w:rPr>
                 <w:rFonts w:ascii="Arial" w:eastAsiaTheme="minorHAnsi" w:hAnsi="Arial" w:cs="Arial"/>
                 <w:color w:val="000000"/>
@@ -821,9 +927,7 @@
                 <w:szCs w:val="18"/>
                 <w:lang w:val="es-MX"/>
               </w:rPr>
-              <w:t>dt</w:t>
-            </w:r>
-            <w:proofErr w:type="spellEnd"/>
+            </w:pPr>
             <w:r>
               <w:rPr>
                 <w:rFonts w:ascii="Arial" w:eastAsiaTheme="minorHAnsi" w:hAnsi="Arial" w:cs="Arial"/>
@@ -832,17 +936,39 @@
                 <w:szCs w:val="18"/>
                 <w:lang w:val="es-MX"/>
               </w:rPr>
+              <w:t>[[</w:t>
+            </w:r>
+            <w:proofErr w:type="spellStart"/>
+            <w:r>
+              <w:rPr>
+                <w:rFonts w:ascii="Arial" w:eastAsiaTheme="minorHAnsi" w:hAnsi="Arial" w:cs="Arial"/>
+                <w:color w:val="000000"/>
+                <w:sz w:val="18"/>
+                <w:szCs w:val="18"/>
+                <w:lang w:val="es-MX"/>
+              </w:rPr>
+              <w:t>anio</w:t>
+            </w:r>
+            <w:proofErr w:type="spellEnd"/>
+            <w:r>
+              <w:rPr>
+                <w:rFonts w:ascii="Arial" w:eastAsiaTheme="minorHAnsi" w:hAnsi="Arial" w:cs="Arial"/>
+                <w:color w:val="000000"/>
+                <w:sz w:val="18"/>
+                <w:szCs w:val="18"/>
+                <w:lang w:val="es-MX"/>
+              </w:rPr>
               <w:t>]]</w:t>
             </w:r>
           </w:p>
         </w:tc>
         <w:tc>
           <w:tcPr>
-            <w:tcW w:w="850" w:type="dxa"/>
+            <w:tcW w:w="952" w:type="dxa"/>
           </w:tcPr>
           <w:p>
             <w:pPr>
-              <w:jc w:val="both"/>
+              <w:jc w:val="center"/>
               <w:rPr>
                 <w:rFonts w:ascii="Arial" w:eastAsiaTheme="minorHAnsi" w:hAnsi="Arial" w:cs="Arial"/>
                 <w:color w:val="000000"/>
@@ -859,13 +985,13 @@
                 <w:szCs w:val="18"/>
                 <w:lang w:val="es-MX"/>
               </w:rPr>
-              <w:t>[[clave]]</w:t>
+              <w:t>[[fecha]]</w:t>
             </w:r>
           </w:p>
         </w:tc>
         <w:tc>
           <w:tcPr>
-            <w:tcW w:w="3544" w:type="dxa"/>
+            <w:tcW w:w="1257" w:type="dxa"/>
           </w:tcPr>
           <w:p>
             <w:pPr>
@@ -886,71 +1012,7 @@
                 <w:szCs w:val="18"/>
                 <w:lang w:val="es-MX"/>
               </w:rPr>
-              <w:t>[[ut]]</w:t>
-            </w:r>
-          </w:p>
-        </w:tc>
-        <w:tc>
-          <w:tcPr>
-            <w:tcW w:w="992" w:type="dxa"/>
-          </w:tcPr>
-          <w:p>
-            <w:pPr>
-              <w:jc w:val="center"/>
-              <w:rPr>
-                <w:rFonts w:ascii="Arial" w:eastAsiaTheme="minorHAnsi" w:hAnsi="Arial" w:cs="Arial"/>
-                <w:color w:val="000000"/>
-                <w:sz w:val="18"/>
-                <w:szCs w:val="18"/>
-                <w:lang w:val="es-MX"/>
-              </w:rPr>
-            </w:pPr>
-            <w:r>
-              <w:rPr>
-                <w:rFonts w:ascii="Arial" w:eastAsiaTheme="minorHAnsi" w:hAnsi="Arial" w:cs="Arial"/>
-                <w:color w:val="000000"/>
-                <w:sz w:val="18"/>
-                <w:szCs w:val="18"/>
-                <w:lang w:val="es-MX"/>
-              </w:rPr>
-              <w:t>[[fecha]]</w:t>
-            </w:r>
-          </w:p>
-        </w:tc>
-        <w:tc>
-          <w:tcPr>
-            <w:tcW w:w="992" w:type="dxa"/>
-          </w:tcPr>
-          <w:p>
-            <w:pPr>
-              <w:jc w:val="center"/>
-              <w:rPr>
-                <w:rFonts w:ascii="Arial" w:eastAsiaTheme="minorHAnsi" w:hAnsi="Arial" w:cs="Arial"/>
-                <w:color w:val="000000"/>
-                <w:sz w:val="18"/>
-                <w:szCs w:val="18"/>
-                <w:lang w:val="es-MX"/>
-              </w:rPr>
-            </w:pPr>
-            <w:r>
-              <w:rPr>
-                <w:rFonts w:ascii="Arial" w:eastAsiaTheme="minorHAnsi" w:hAnsi="Arial" w:cs="Arial"/>
-                <w:color w:val="000000"/>
-                <w:sz w:val="18"/>
-                <w:szCs w:val="18"/>
-                <w:lang w:val="es-MX"/>
-              </w:rPr>
-              <w:t>[[hora]]</w:t>
-            </w:r>
-            <w:r>
-              <w:rPr>
-                <w:rFonts w:ascii="Arial" w:eastAsiaTheme="minorHAnsi" w:hAnsi="Arial" w:cs="Arial"/>
-                <w:color w:val="000000"/>
-                <w:sz w:val="18"/>
-                <w:szCs w:val="18"/>
-                <w:lang w:val="es-MX"/>
-              </w:rPr>
-              <w:t xml:space="preserve"> [[/productos]]</w:t>
+              <w:t>[[hora]] [[/productos]]</w:t>
             </w:r>
           </w:p>
         </w:tc>
@@ -1137,7 +1199,7 @@
               </wp:anchor>
             </w:drawing>
           </mc:Choice>
-          <mc:Fallback xmlns:w16sdtfl="http://schemas.microsoft.com/office/word/2024/wordml/sdtformatlock" xmlns:w16sdtdh="http://schemas.microsoft.com/office/word/2020/wordml/sdtdatahash" xmlns:w16du="http://schemas.microsoft.com/office/word/2023/wordml/word16du" xmlns:w16="http://schemas.microsoft.com/office/word/2018/wordml" xmlns:w16cid="http://schemas.microsoft.com/office/word/2016/wordml/cid" xmlns:w16cex="http://schemas.microsoft.com/office/word/2018/wordml/cex" xmlns:oel="http://schemas.microsoft.com/office/2019/extlst" xmlns:am3d="http://schemas.microsoft.com/office/drawing/2017/model3d" xmlns:aink="http://schemas.microsoft.com/office/drawing/2016/ink" xmlns:cx8="http://schemas.microsoft.com/office/drawing/2016/5/14/chartex" xmlns:cx7="http://schemas.microsoft.com/office/drawing/2016/5/13/chartex" xmlns:cx6="http://schemas.microsoft.com/office/drawing/2016/5/12/chartex" xmlns:cx5="http://schemas.microsoft.com/office/drawing/2016/5/11/chartex" xmlns:cx4="http://schemas.microsoft.com/office/drawing/2016/5/10/chartex" xmlns:cx3="http://schemas.microsoft.com/office/drawing/2016/5/9/chartex" xmlns:cx2="http://schemas.microsoft.com/office/drawing/2015/10/21/chartex" xmlns:cx1="http://schemas.microsoft.com/office/drawing/2015/9/8/chartex">
+          <mc:Fallback>
             <w:pict>
               <v:rect w14:anchorId="065B3B62" id="Rectangle 2" o:spid="_x0000_s1027" style="position:absolute;margin-left:178.9pt;margin-top:21.75pt;width:110.65pt;height:95.6pt;z-index:-251653120;visibility:visible;mso-wrap-style:square;mso-width-percent:0;mso-height-percent:0;mso-wrap-distance-left:9pt;mso-wrap-distance-top:0;mso-wrap-distance-right:9pt;mso-wrap-distance-bottom:0;mso-position-horizontal:absolute;mso-position-horizontal-relative:margin;mso-position-vertical:absolute;mso-position-vertical-relative:text;mso-width-percent:0;mso-height-percent:0;mso-width-relative:page;mso-height-relative:page;v-text-anchor:top" o:gfxdata="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">
                 <v:textbox>
@@ -1588,7 +1650,7 @@
 </file>
 
 <file path=word/endnotes.xml><?xml version="1.0" encoding="utf-8"?>
-<w:endnotes xmlns:wpc="http://schemas.microsoft.com/office/word/2010/wordprocessingCanvas" xmlns:cx="http://schemas.microsoft.com/office/drawing/2014/chartex" xmlns:mc="http://schemas.openxmlformats.org/markup-compatibility/2006" xmlns:o="urn:schemas-microsoft-com:office:office" xmlns:r="http://schemas.openxmlformats.org/officeDocument/2006/relationships" xmlns:m="http://schemas.openxmlformats.org/officeDocument/2006/math" xmlns:v="urn:schemas-microsoft-com:vml" xmlns:wp14="http://schemas.microsoft.com/office/word/2010/wordprocessingDrawing" xmlns:wp="http://schemas.openxmlformats.org/drawingml/2006/wordprocessingDrawing" xmlns:w10="urn:schemas-microsoft-com:office:word" xmlns:w="http://schemas.openxmlformats.org/wordprocessingml/2006/main" xmlns:w14="http://schemas.microsoft.com/office/word/2010/wordml" xmlns:w15="http://schemas.microsoft.com/office/word/2012/wordml" xmlns:w16se="http://schemas.microsoft.com/office/word/2015/wordml/symex" xmlns:wpg="http://schemas.microsoft.com/office/word/2010/wordprocessingGroup" xmlns:wpi="http://schemas.microsoft.com/office/word/2010/wordprocessingInk" xmlns:wne="http://schemas.microsoft.com/office/word/2006/wordml" xmlns:wps="http://schemas.microsoft.com/office/word/2010/wordprocessingShape" mc:Ignorable="w14 w15 w16se wp14">
+<w:endnotes xmlns:wpc="http://schemas.microsoft.com/office/word/2010/wordprocessingCanvas" xmlns:cx="http://schemas.microsoft.com/office/drawing/2014/chartex" xmlns:cx1="http://schemas.microsoft.com/office/drawing/2015/9/8/chartex" xmlns:cx2="http://schemas.microsoft.com/office/drawing/2015/10/21/chartex" xmlns:cx3="http://schemas.microsoft.com/office/drawing/2016/5/9/chartex" xmlns:cx4="http://schemas.microsoft.com/office/drawing/2016/5/10/chartex" xmlns:cx5="http://schemas.microsoft.com/office/drawing/2016/5/11/chartex" xmlns:cx6="http://schemas.microsoft.com/office/drawing/2016/5/12/chartex" xmlns:cx7="http://schemas.microsoft.com/office/drawing/2016/5/13/chartex" xmlns:cx8="http://schemas.microsoft.com/office/drawing/2016/5/14/chartex" xmlns:mc="http://schemas.openxmlformats.org/markup-compatibility/2006" xmlns:aink="http://schemas.microsoft.com/office/drawing/2016/ink" xmlns:am3d="http://schemas.microsoft.com/office/drawing/2017/model3d" xmlns:o="urn:schemas-microsoft-com:office:office" xmlns:oel="http://schemas.microsoft.com/office/2019/extlst" xmlns:r="http://schemas.openxmlformats.org/officeDocument/2006/relationships" xmlns:m="http://schemas.openxmlformats.org/officeDocument/2006/math" xmlns:v="urn:schemas-microsoft-com:vml" xmlns:wp14="http://schemas.microsoft.com/office/word/2010/wordprocessingDrawing" xmlns:wp="http://schemas.openxmlformats.org/drawingml/2006/wordprocessingDrawing" xmlns:w10="urn:schemas-microsoft-com:office:word" xmlns:w="http://schemas.openxmlformats.org/wordprocessingml/2006/main" xmlns:w14="http://schemas.microsoft.com/office/word/2010/wordml" xmlns:w15="http://schemas.microsoft.com/office/word/2012/wordml" xmlns:w16cex="http://schemas.microsoft.com/office/word/2018/wordml/cex" xmlns:w16cid="http://schemas.microsoft.com/office/word/2016/wordml/cid" xmlns:w16="http://schemas.microsoft.com/office/word/2018/wordml" xmlns:w16du="http://schemas.microsoft.com/office/word/2023/wordml/word16du" xmlns:w16sdtdh="http://schemas.microsoft.com/office/word/2020/wordml/sdtdatahash" xmlns:w16sdtfl="http://schemas.microsoft.com/office/word/2024/wordml/sdtformatlock" xmlns:w16se="http://schemas.microsoft.com/office/word/2015/wordml/symex" xmlns:wpg="http://schemas.microsoft.com/office/word/2010/wordprocessingGroup" xmlns:wpi="http://schemas.microsoft.com/office/word/2010/wordprocessingInk" xmlns:wne="http://schemas.microsoft.com/office/word/2006/wordml" xmlns:wps="http://schemas.microsoft.com/office/word/2010/wordprocessingShape" mc:Ignorable="w14 w15 w16se w16cid w16 w16cex w16sdtdh w16sdtfl w16du wp14">
   <w:endnote w:type="separator" w:id="-1">
     <w:p>
       <w:r>
@@ -1607,7 +1669,7 @@
 </file>
 
 <file path=word/footer1.xml><?xml version="1.0" encoding="utf-8"?>
-<w:ftr xmlns:wpc="http://schemas.microsoft.com/office/word/2010/wordprocessingCanvas" xmlns:cx="http://schemas.microsoft.com/office/drawing/2014/chartex" xmlns:mc="http://schemas.openxmlformats.org/markup-compatibility/2006" xmlns:o="urn:schemas-microsoft-com:office:office" xmlns:r="http://schemas.openxmlformats.org/officeDocument/2006/relationships" xmlns:m="http://schemas.openxmlformats.org/officeDocument/2006/math" xmlns:v="urn:schemas-microsoft-com:vml" xmlns:wp14="http://schemas.microsoft.com/office/word/2010/wordprocessingDrawing" xmlns:wp="http://schemas.openxmlformats.org/drawingml/2006/wordprocessingDrawing" xmlns:w10="urn:schemas-microsoft-com:office:word" xmlns:w="http://schemas.openxmlformats.org/wordprocessingml/2006/main" xmlns:w14="http://schemas.microsoft.com/office/word/2010/wordml" xmlns:w15="http://schemas.microsoft.com/office/word/2012/wordml" xmlns:w16se="http://schemas.microsoft.com/office/word/2015/wordml/symex" xmlns:wpg="http://schemas.microsoft.com/office/word/2010/wordprocessingGroup" xmlns:wpi="http://schemas.microsoft.com/office/word/2010/wordprocessingInk" xmlns:wne="http://schemas.microsoft.com/office/word/2006/wordml" xmlns:wps="http://schemas.microsoft.com/office/word/2010/wordprocessingShape" mc:Ignorable="w14 w15 w16se wp14">
+<w:ftr xmlns:wpc="http://schemas.microsoft.com/office/word/2010/wordprocessingCanvas" xmlns:cx="http://schemas.microsoft.com/office/drawing/2014/chartex" xmlns:cx1="http://schemas.microsoft.com/office/drawing/2015/9/8/chartex" xmlns:cx2="http://schemas.microsoft.com/office/drawing/2015/10/21/chartex" xmlns:cx3="http://schemas.microsoft.com/office/drawing/2016/5/9/chartex" xmlns:cx4="http://schemas.microsoft.com/office/drawing/2016/5/10/chartex" xmlns:cx5="http://schemas.microsoft.com/office/drawing/2016/5/11/chartex" xmlns:cx6="http://schemas.microsoft.com/office/drawing/2016/5/12/chartex" xmlns:cx7="http://schemas.microsoft.com/office/drawing/2016/5/13/chartex" xmlns:cx8="http://schemas.microsoft.com/office/drawing/2016/5/14/chartex" xmlns:mc="http://schemas.openxmlformats.org/markup-compatibility/2006" xmlns:aink="http://schemas.microsoft.com/office/drawing/2016/ink" xmlns:am3d="http://schemas.microsoft.com/office/drawing/2017/model3d" xmlns:o="urn:schemas-microsoft-com:office:office" xmlns:oel="http://schemas.microsoft.com/office/2019/extlst" xmlns:r="http://schemas.openxmlformats.org/officeDocument/2006/relationships" xmlns:m="http://schemas.openxmlformats.org/officeDocument/2006/math" xmlns:v="urn:schemas-microsoft-com:vml" xmlns:wp14="http://schemas.microsoft.com/office/word/2010/wordprocessingDrawing" xmlns:wp="http://schemas.openxmlformats.org/drawingml/2006/wordprocessingDrawing" xmlns:w10="urn:schemas-microsoft-com:office:word" xmlns:w="http://schemas.openxmlformats.org/wordprocessingml/2006/main" xmlns:w14="http://schemas.microsoft.com/office/word/2010/wordml" xmlns:w15="http://schemas.microsoft.com/office/word/2012/wordml" xmlns:w16cex="http://schemas.microsoft.com/office/word/2018/wordml/cex" xmlns:w16cid="http://schemas.microsoft.com/office/word/2016/wordml/cid" xmlns:w16="http://schemas.microsoft.com/office/word/2018/wordml" xmlns:w16du="http://schemas.microsoft.com/office/word/2023/wordml/word16du" xmlns:w16sdtdh="http://schemas.microsoft.com/office/word/2020/wordml/sdtdatahash" xmlns:w16sdtfl="http://schemas.microsoft.com/office/word/2024/wordml/sdtformatlock" xmlns:w16se="http://schemas.microsoft.com/office/word/2015/wordml/symex" xmlns:wpg="http://schemas.microsoft.com/office/word/2010/wordprocessingGroup" xmlns:wpi="http://schemas.microsoft.com/office/word/2010/wordprocessingInk" xmlns:wne="http://schemas.microsoft.com/office/word/2006/wordml" xmlns:wps="http://schemas.microsoft.com/office/word/2010/wordprocessingShape" mc:Ignorable="w14 w15 w16se w16cid w16 w16cex w16sdtdh w16sdtfl w16du wp14">
   <w:sdt>
     <w:sdtPr>
       <w:id w:val="2063512115"/>
@@ -1616,7 +1678,6 @@
         <w:docPartUnique/>
       </w:docPartObj>
     </w:sdtPr>
-    <w:sdtEndPr/>
     <w:sdtContent>
       <w:sdt>
         <w:sdtPr>
@@ -1626,7 +1687,6 @@
             <w:docPartUnique/>
           </w:docPartObj>
         </w:sdtPr>
-        <w:sdtEndPr/>
         <w:sdtContent>
           <w:p>
             <w:pPr>
@@ -1743,7 +1803,7 @@
 </file>
 
 <file path=word/footnotes.xml><?xml version="1.0" encoding="utf-8"?>
-<w:footnotes xmlns:wpc="http://schemas.microsoft.com/office/word/2010/wordprocessingCanvas" xmlns:cx="http://schemas.microsoft.com/office/drawing/2014/chartex" xmlns:mc="http://schemas.openxmlformats.org/markup-compatibility/2006" xmlns:o="urn:schemas-microsoft-com:office:office" xmlns:r="http://schemas.openxmlformats.org/officeDocument/2006/relationships" xmlns:m="http://schemas.openxmlformats.org/officeDocument/2006/math" xmlns:v="urn:schemas-microsoft-com:vml" xmlns:wp14="http://schemas.microsoft.com/office/word/2010/wordprocessingDrawing" xmlns:wp="http://schemas.openxmlformats.org/drawingml/2006/wordprocessingDrawing" xmlns:w10="urn:schemas-microsoft-com:office:word" xmlns:w="http://schemas.openxmlformats.org/wordprocessingml/2006/main" xmlns:w14="http://schemas.microsoft.com/office/word/2010/wordml" xmlns:w15="http://schemas.microsoft.com/office/word/2012/wordml" xmlns:w16se="http://schemas.microsoft.com/office/word/2015/wordml/symex" xmlns:wpg="http://schemas.microsoft.com/office/word/2010/wordprocessingGroup" xmlns:wpi="http://schemas.microsoft.com/office/word/2010/wordprocessingInk" xmlns:wne="http://schemas.microsoft.com/office/word/2006/wordml" xmlns:wps="http://schemas.microsoft.com/office/word/2010/wordprocessingShape" mc:Ignorable="w14 w15 w16se wp14">
+<w:footnotes xmlns:wpc="http://schemas.microsoft.com/office/word/2010/wordprocessingCanvas" xmlns:cx="http://schemas.microsoft.com/office/drawing/2014/chartex" xmlns:cx1="http://schemas.microsoft.com/office/drawing/2015/9/8/chartex" xmlns:cx2="http://schemas.microsoft.com/office/drawing/2015/10/21/chartex" xmlns:cx3="http://schemas.microsoft.com/office/drawing/2016/5/9/chartex" xmlns:cx4="http://schemas.microsoft.com/office/drawing/2016/5/10/chartex" xmlns:cx5="http://schemas.microsoft.com/office/drawing/2016/5/11/chartex" xmlns:cx6="http://schemas.microsoft.com/office/drawing/2016/5/12/chartex" xmlns:cx7="http://schemas.microsoft.com/office/drawing/2016/5/13/chartex" xmlns:cx8="http://schemas.microsoft.com/office/drawing/2016/5/14/chartex" xmlns:mc="http://schemas.openxmlformats.org/markup-compatibility/2006" xmlns:aink="http://schemas.microsoft.com/office/drawing/2016/ink" xmlns:am3d="http://schemas.microsoft.com/office/drawing/2017/model3d" xmlns:o="urn:schemas-microsoft-com:office:office" xmlns:oel="http://schemas.microsoft.com/office/2019/extlst" xmlns:r="http://schemas.openxmlformats.org/officeDocument/2006/relationships" xmlns:m="http://schemas.openxmlformats.org/officeDocument/2006/math" xmlns:v="urn:schemas-microsoft-com:vml" xmlns:wp14="http://schemas.microsoft.com/office/word/2010/wordprocessingDrawing" xmlns:wp="http://schemas.openxmlformats.org/drawingml/2006/wordprocessingDrawing" xmlns:w10="urn:schemas-microsoft-com:office:word" xmlns:w="http://schemas.openxmlformats.org/wordprocessingml/2006/main" xmlns:w14="http://schemas.microsoft.com/office/word/2010/wordml" xmlns:w15="http://schemas.microsoft.com/office/word/2012/wordml" xmlns:w16cex="http://schemas.microsoft.com/office/word/2018/wordml/cex" xmlns:w16cid="http://schemas.microsoft.com/office/word/2016/wordml/cid" xmlns:w16="http://schemas.microsoft.com/office/word/2018/wordml" xmlns:w16du="http://schemas.microsoft.com/office/word/2023/wordml/word16du" xmlns:w16sdtdh="http://schemas.microsoft.com/office/word/2020/wordml/sdtdatahash" xmlns:w16sdtfl="http://schemas.microsoft.com/office/word/2024/wordml/sdtformatlock" xmlns:w16se="http://schemas.microsoft.com/office/word/2015/wordml/symex" xmlns:wpg="http://schemas.microsoft.com/office/word/2010/wordprocessingGroup" xmlns:wpi="http://schemas.microsoft.com/office/word/2010/wordprocessingInk" xmlns:wne="http://schemas.microsoft.com/office/word/2006/wordml" xmlns:wps="http://schemas.microsoft.com/office/word/2010/wordprocessingShape" mc:Ignorable="w14 w15 w16se w16cid w16 w16cex w16sdtdh w16sdtfl w16du wp14">
   <w:footnote w:type="separator" w:id="-1">
     <w:p>
       <w:r>
@@ -1762,7 +1822,7 @@
 </file>
 
 <file path=word/styles.xml><?xml version="1.0" encoding="utf-8"?>
-<w:styles xmlns:mc="http://schemas.openxmlformats.org/markup-compatibility/2006" xmlns:r="http://schemas.openxmlformats.org/officeDocument/2006/relationships" xmlns:w="http://schemas.openxmlformats.org/wordprocessingml/2006/main" xmlns:w14="http://schemas.microsoft.com/office/word/2010/wordml" xmlns:w15="http://schemas.microsoft.com/office/word/2012/wordml" xmlns:w16se="http://schemas.microsoft.com/office/word/2015/wordml/symex" mc:Ignorable="w14 w15 w16se">
+<w:styles xmlns:mc="http://schemas.openxmlformats.org/markup-compatibility/2006" xmlns:r="http://schemas.openxmlformats.org/officeDocument/2006/relationships" xmlns:w="http://schemas.openxmlformats.org/wordprocessingml/2006/main" xmlns:w14="http://schemas.microsoft.com/office/word/2010/wordml" xmlns:w15="http://schemas.microsoft.com/office/word/2012/wordml" xmlns:w16cex="http://schemas.microsoft.com/office/word/2018/wordml/cex" xmlns:w16cid="http://schemas.microsoft.com/office/word/2016/wordml/cid" xmlns:w16="http://schemas.microsoft.com/office/word/2018/wordml" xmlns:w16du="http://schemas.microsoft.com/office/word/2023/wordml/word16du" xmlns:w16sdtdh="http://schemas.microsoft.com/office/word/2020/wordml/sdtdatahash" xmlns:w16sdtfl="http://schemas.microsoft.com/office/word/2024/wordml/sdtformatlock" xmlns:w16se="http://schemas.microsoft.com/office/word/2015/wordml/symex" mc:Ignorable="w14 w15 w16se w16cid w16 w16cex w16sdtdh w16sdtfl w16du">
   <w:docDefaults>
     <w:rPrDefault>
       <w:rPr>
@@ -1780,7 +1840,7 @@
       </w:pPr>
     </w:pPrDefault>
   </w:docDefaults>
-  <w:latentStyles w:defLockedState="0" w:defUIPriority="99" w:defSemiHidden="0" w:defUnhideWhenUsed="0" w:defQFormat="0" w:count="371">
+  <w:latentStyles w:defLockedState="0" w:defUIPriority="99" w:defSemiHidden="0" w:defUnhideWhenUsed="0" w:defQFormat="0" w:count="376">
     <w:lsdException w:name="Normal" w:uiPriority="0" w:qFormat="1"/>
     <w:lsdException w:name="heading 1" w:uiPriority="9" w:qFormat="1"/>
     <w:lsdException w:name="heading 2" w:semiHidden="1" w:uiPriority="9" w:unhideWhenUsed="1" w:qFormat="1"/>
@@ -2152,6 +2212,11 @@
     <w:lsdException w:name="List Table 5 Dark Accent 6" w:uiPriority="50"/>
     <w:lsdException w:name="List Table 6 Colorful Accent 6" w:uiPriority="51"/>
     <w:lsdException w:name="List Table 7 Colorful Accent 6" w:uiPriority="52"/>
+    <w:lsdException w:name="Mention" w:semiHidden="1" w:unhideWhenUsed="1"/>
+    <w:lsdException w:name="Smart Hyperlink" w:semiHidden="1" w:unhideWhenUsed="1"/>
+    <w:lsdException w:name="Hashtag" w:semiHidden="1" w:unhideWhenUsed="1"/>
+    <w:lsdException w:name="Unresolved Mention" w:semiHidden="1" w:unhideWhenUsed="1"/>
+    <w:lsdException w:name="Smart Link" w:semiHidden="1" w:unhideWhenUsed="1"/>
   </w:latentStyles>
   <w:style w:type="paragraph" w:default="1" w:styleId="Normal">
     <w:name w:val="Normal"/>

</xml_diff>

<commit_message>
Se ajustan constancias a distrito 10 y 31
</commit_message>
<xml_diff>
--- a/Front-SIPROE/public/assets/Anexo-Invitacion.docx
+++ b/Front-SIPROE/public/assets/Anexo-Invitacion.docx
@@ -1100,147 +1100,7 @@
         <w:t>[[distrito]]</w:t>
       </w:r>
     </w:p>
-    <w:p>
-      <w:r>
-        <w:rPr>
-          <w:rFonts w:ascii="Arial" w:eastAsia="Times New Roman" w:hAnsi="Arial" w:cs="Arial"/>
-          <w:noProof/>
-          <w:szCs w:val="24"/>
-          <w:lang w:val="es-MX" w:eastAsia="es-MX"/>
-        </w:rPr>
-        <mc:AlternateContent>
-          <mc:Choice Requires="wps">
-            <w:drawing>
-              <wp:anchor distT="0" distB="0" distL="114300" distR="114300" simplePos="0" relativeHeight="251663360" behindDoc="1" locked="0" layoutInCell="1" allowOverlap="1" wp14:anchorId="065B3B62" wp14:editId="7501D9B8">
-                <wp:simplePos x="0" y="0"/>
-                <wp:positionH relativeFrom="margin">
-                  <wp:posOffset>2272071</wp:posOffset>
-                </wp:positionH>
-                <wp:positionV relativeFrom="paragraph">
-                  <wp:posOffset>276530</wp:posOffset>
-                </wp:positionV>
-                <wp:extent cx="1405255" cy="1214120"/>
-                <wp:effectExtent l="0" t="0" r="23495" b="24130"/>
-                <wp:wrapNone/>
-                <wp:docPr id="1" name="Rectangle 2"/>
-                <wp:cNvGraphicFramePr>
-                  <a:graphicFrameLocks xmlns:a="http://schemas.openxmlformats.org/drawingml/2006/main"/>
-                </wp:cNvGraphicFramePr>
-                <a:graphic xmlns:a="http://schemas.openxmlformats.org/drawingml/2006/main">
-                  <a:graphicData uri="http://schemas.microsoft.com/office/word/2010/wordprocessingShape">
-                    <wps:wsp>
-                      <wps:cNvSpPr>
-                        <a:spLocks noChangeArrowheads="1"/>
-                      </wps:cNvSpPr>
-                      <wps:spPr bwMode="auto">
-                        <a:xfrm>
-                          <a:off x="0" y="0"/>
-                          <a:ext cx="1405255" cy="1214120"/>
-                        </a:xfrm>
-                        <a:prstGeom prst="rect">
-                          <a:avLst/>
-                        </a:prstGeom>
-                        <a:solidFill>
-                          <a:srgbClr val="FFFFFF"/>
-                        </a:solidFill>
-                        <a:ln w="9525">
-                          <a:solidFill>
-                            <a:srgbClr val="000000"/>
-                          </a:solidFill>
-                          <a:miter lim="800000"/>
-                          <a:headEnd/>
-                          <a:tailEnd/>
-                        </a:ln>
-                      </wps:spPr>
-                      <wps:txbx>
-                        <w:txbxContent>
-                          <w:p>
-                            <w:pPr>
-                              <w:jc w:val="center"/>
-                              <w:rPr>
-                                <w:rFonts w:ascii="Arial" w:hAnsi="Arial" w:cs="Arial"/>
-                                <w:sz w:val="20"/>
-                                <w:szCs w:val="20"/>
-                              </w:rPr>
-                            </w:pPr>
-                          </w:p>
-                          <w:p>
-                            <w:pPr>
-                              <w:jc w:val="center"/>
-                              <w:rPr>
-                                <w:rFonts w:ascii="Arial" w:hAnsi="Arial" w:cs="Arial"/>
-                                <w:color w:val="D9D9D9"/>
-                              </w:rPr>
-                            </w:pPr>
-                            <w:r>
-                              <w:rPr>
-                                <w:rFonts w:ascii="Arial" w:hAnsi="Arial" w:cs="Arial"/>
-                                <w:color w:val="D9D9D9"/>
-                                <w:sz w:val="32"/>
-                                <w:szCs w:val="32"/>
-                              </w:rPr>
-                              <w:t>Sello de DD</w:t>
-                            </w:r>
-                          </w:p>
-                        </w:txbxContent>
-                      </wps:txbx>
-                      <wps:bodyPr rot="0" vert="horz" wrap="square" lIns="91440" tIns="45720" rIns="91440" bIns="45720" anchor="t" anchorCtr="0" upright="1">
-                        <a:noAutofit/>
-                      </wps:bodyPr>
-                    </wps:wsp>
-                  </a:graphicData>
-                </a:graphic>
-                <wp14:sizeRelH relativeFrom="page">
-                  <wp14:pctWidth>0</wp14:pctWidth>
-                </wp14:sizeRelH>
-                <wp14:sizeRelV relativeFrom="page">
-                  <wp14:pctHeight>0</wp14:pctHeight>
-                </wp14:sizeRelV>
-              </wp:anchor>
-            </w:drawing>
-          </mc:Choice>
-          <mc:Fallback>
-            <w:pict>
-              <v:rect w14:anchorId="065B3B62" id="Rectangle 2" o:spid="_x0000_s1027" style="position:absolute;margin-left:178.9pt;margin-top:21.75pt;width:110.65pt;height:95.6pt;z-index:-251653120;visibility:visible;mso-wrap-style:square;mso-width-percent:0;mso-height-percent:0;mso-wrap-distance-left:9pt;mso-wrap-distance-top:0;mso-wrap-distance-right:9pt;mso-wrap-distance-bottom:0;mso-position-horizontal:absolute;mso-position-horizontal-relative:margin;mso-position-vertical:absolute;mso-position-vertical-relative:text;mso-width-percent:0;mso-height-percent:0;mso-width-relative:page;mso-height-relative:page;v-text-anchor:top" o:gfxdata="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">
-                <v:textbox>
-                  <w:txbxContent>
-                    <w:p>
-                      <w:pPr>
-                        <w:jc w:val="center"/>
-                        <w:rPr>
-                          <w:rFonts w:ascii="Arial" w:hAnsi="Arial" w:cs="Arial"/>
-                          <w:sz w:val="20"/>
-                          <w:szCs w:val="20"/>
-                        </w:rPr>
-                      </w:pPr>
-                    </w:p>
-                    <w:p>
-                      <w:pPr>
-                        <w:jc w:val="center"/>
-                        <w:rPr>
-                          <w:rFonts w:ascii="Arial" w:hAnsi="Arial" w:cs="Arial"/>
-                          <w:color w:val="D9D9D9"/>
-                        </w:rPr>
-                      </w:pPr>
-                      <w:r>
-                        <w:rPr>
-                          <w:rFonts w:ascii="Arial" w:hAnsi="Arial" w:cs="Arial"/>
-                          <w:color w:val="D9D9D9"/>
-                          <w:sz w:val="32"/>
-                          <w:szCs w:val="32"/>
-                        </w:rPr>
-                        <w:t>Sello de DD</w:t>
-                      </w:r>
-                    </w:p>
-                  </w:txbxContent>
-                </v:textbox>
-                <w10:wrap anchorx="margin"/>
-              </v:rect>
-            </w:pict>
-          </mc:Fallback>
-        </mc:AlternateContent>
-      </w:r>
-    </w:p>
+    <w:p/>
     <w:tbl>
       <w:tblPr>
         <w:tblStyle w:val="Tablaconcuadrcula"/>
@@ -1433,7 +1293,7 @@
                 <w:color w:val="404040" w:themeColor="text1" w:themeTint="BF"/>
                 <w:sz w:val="20"/>
               </w:rPr>
-              <w:t xml:space="preserve">Titular de </w:t>
+              <w:t>[[</w:t>
             </w:r>
             <w:r>
               <w:rPr>
@@ -1442,7 +1302,7 @@
                 <w:color w:val="404040" w:themeColor="text1" w:themeTint="BF"/>
                 <w:sz w:val="20"/>
               </w:rPr>
-              <w:t>Ó</w:t>
+              <w:t>titular</w:t>
             </w:r>
             <w:r>
               <w:rPr>
@@ -1451,7 +1311,7 @@
                 <w:color w:val="404040" w:themeColor="text1" w:themeTint="BF"/>
                 <w:sz w:val="20"/>
               </w:rPr>
-              <w:t>rgano Desconcentrado</w:t>
+              <w:t>]]</w:t>
             </w:r>
           </w:p>
           <w:p>

</xml_diff>

<commit_message>
(Update) Se actualizan constancias
</commit_message>
<xml_diff>
--- a/Front-SIPROE/public/assets/Anexo-Invitacion.docx
+++ b/Front-SIPROE/public/assets/Anexo-Invitacion.docx
@@ -1293,25 +1293,7 @@
                 <w:color w:val="404040" w:themeColor="text1" w:themeTint="BF"/>
                 <w:sz w:val="20"/>
               </w:rPr>
-              <w:t>[[</w:t>
-            </w:r>
-            <w:r>
-              <w:rPr>
-                <w:rFonts w:ascii="Arial"/>
-                <w:bCs/>
-                <w:color w:val="404040" w:themeColor="text1" w:themeTint="BF"/>
-                <w:sz w:val="20"/>
-              </w:rPr>
-              <w:t>titular</w:t>
-            </w:r>
-            <w:r>
-              <w:rPr>
-                <w:rFonts w:ascii="Arial"/>
-                <w:bCs/>
-                <w:color w:val="404040" w:themeColor="text1" w:themeTint="BF"/>
-                <w:sz w:val="20"/>
-              </w:rPr>
-              <w:t>]]</w:t>
+              <w:t>[[titular]]</w:t>
             </w:r>
           </w:p>
           <w:p>

</xml_diff>